<commit_message>
Add L4 draft gold labels and precision/recall results to paper
Co-Authored-By: Claude Sonnet 5.5 <noreply@anthropic.com>
</commit_message>
<xml_diff>
--- a/paper/paper_kcc.docx
+++ b/paper/paper_kcc.docx
@@ -80,7 +80,7 @@
           <w:rFonts w:ascii="굴림" w:hAnsi="굴림" w:eastAsia="굴림"/>
           <w:sz w:val="18"/>
         </w:rPr>
-        <w:t>한다. LangChain 강좌의 주피터 노트북(Jupyter Notebook) 6개를 코드 실행 없이 추상 구문 트리(Abstract Syntax Tree, AST)로 분석해 API 경로를 추출하고, PyPI 배포본 소스에서 현재 경로를 확인한 뒤, 과거 배포본에서 기존 경로와 새 경로를 잇는 근거가 있을 때만 이동 확인(MOVED)으로 판정한다. 188건의 API 출현(고유 경로 52개) 중 146건(48개)에서 현재 경로를 찾았고 42건은 미검증(UNVERIFIED)으로 남았다. 비교 버전을 설치해 직접 가져오기를 실행한 결과 기존 경로 52개는 모두 실패하고 제시한 현재 경로 48개는 모두 성공했다. 다만 추출 단계의 정확도는 독립 정답표가 없어 평가하지 못했고, 동작 호환성은 보증하지 않는다.</w:t>
+        <w:t>한다. LangChain 강좌의 주피터 노트북(Jupyter Notebook) 6개를 코드 실행 없이 추상 구문 트리(Abstract Syntax Tree, AST)로 분석해 API 경로를 추출하고, PyPI 배포본 소스에서 현재 경로를 확인한 뒤, 과거 배포본에서 기존 경로와 새 경로를 잇는 근거가 있을 때만 이동 확인(MOVED)으로 판정한다. 188건의 API 출현(고유 경로 52개) 중 146건(48개)에서 현재 경로를 찾았고 42건은 미검증(UNVERIFIED)으로 남았다. 비교 버전을 설치해 직접 가져오기를 실행한 결과 기존 경로 52개는 모두 실패하고 제시한 현재 경로 48개는 모두 성공했다. 추출 단계는 노트북 1개(L4)만 정답표와 비교해 정밀도 0.878, 재현율 0.878을 얻었고 나머지 5개는 평가하지 못했으며, 동작 호환성은 보증하지 않는다.</w:t>
       </w:r>
     </w:p>
     <w:p>
@@ -155,7 +155,7 @@
         <w:rPr>
           <w:rFonts w:ascii="굴림" w:hAnsi="굴림" w:eastAsia="굴림"/>
         </w:rPr>
-        <w:t>기여는 다섯 가지이다. (1) 노트북 6개에서 188건의 API 출현을 코드 실행 없이 추출했다. (2) "최신에서 찾지 못함"과 "이동이 확인됨"을 구분하는 판정 기준을 구현했다. (3) 실험으로 고유 경로 52개 중 48개(146건)의 현재 경로를 파일·줄·버전 근거와 함께 확인했다. (4) 비교 버전을 설치해 가져오기를 실제로 실행해, 기존 경로 52개가 모두 실패하고 제시한 경로 48개가 모두 성공함을 확인했다. (5) 근거가 부족한 4개(18건)와 경로를 추론하지 못한 24건을 한계로 분리했다.</w:t>
+        <w:t>기여는 네 가지이다. (1) 노트북 6개에서 188건의 API 출현을 코드 실행 없이 추출했다. (2) "최신에서 찾지 못함"과 "이동이 확인됨"을 구분하는 판정 기준을 구현했다. (3) 실험으로 고유 경로 52개 중 48개(146건)의 현재 경로를 파일·줄·버전 근거와 함께 확인했다. (4) 비교 버전을 설치해 가져오기를 실제로 실행해, 기존 경로 52개가 모두 실패하고 제시한 경로 48개가 모두 성공함을 확인했다.</w:t>
       </w:r>
     </w:p>
     <w:p>
@@ -893,7 +893,7 @@
         <w:rPr>
           <w:rFonts w:ascii="굴림" w:hAnsi="굴림" w:eastAsia="굴림"/>
         </w:rPr>
-        <w:t xml:space="preserve"> 비교 버전은 langchain 1.3.13, langchain-community 0.4.2, langchain-core 1.6.9, langchain-text-splitters 1.1.3, langchain-openai 1.7.0, langchain-classic 1.0.8이고, 근거 버전은 langchain 0.3.27(보조: community 0.3.27, core 0.3.72, text-splitters 0.3.9)이며 모두 PyPI 공식 배포본이다[4]. Python 3.12.10으로 2026-10-11에 분석했다. 문자열 유사도 임계값은 쓰지 않았다(3.2절). 같은 명령을 다시 실행해 188행의 결과가 일치함을 확인했다.</w:t>
+        <w:t xml:space="preserve"> 비교 버전은 langchain 1.3.13, langchain-community 0.4.2, langchain-core 1.6.9, langchain-text-splitters 1.1.3, langchain-openai 1.7.0, langchain-classic 1.0.8이고, 근거 버전은 langchain 0.3.27(보조: community 0.3.27, core 0.3.72, text-splitters 0.3.9)이며 모두 PyPI 공식 배포본이다[4]. Python 3.12.10으로 2026-10-11에 분석했다. 같은 명령을 다시 실행해 188행의 결과가 일치함을 확인했다.</w:t>
       </w:r>
     </w:p>
     <w:p>
@@ -1846,7 +1846,7 @@
         <w:rPr>
           <w:rFonts w:ascii="굴림" w:hAnsi="굴림" w:eastAsia="굴림"/>
         </w:rPr>
-        <w:t xml:space="preserve"> 고유 경로 52개를 10개 기준으로 점검해 표 4에 정리했다. 기준 1~4, 7~9는 분석기 결과와 가져오기 실행 결과에서 계산했고, 기준 5(기능적 동등성)와 6(Git 변경 이력)은 구현하지 않아 모두 "미확인"이다. 기준 10은 공식 재노출 확인(7)과 가져오기 성공(9)이 모두 있으면 "확정", 패키지 분할로 소스 동일성만 있으면 "검토 필요", 현재 경로가 없으면 "부적합"으로 계산한 규칙 값이다. 따라서 "확정"은 경로 대체의 근거가 갖춰졌다는 뜻이며 동작이 같다는 뜻이 아니다. 확정 38개(126건), 검토 필요 10개(20건), 부적합 4개(18건)이다. 경로별 전체 표는 저장소(</w:t>
+        <w:t xml:space="preserve"> 고유 경로 52개를 10개 기준으로 점검해 표 4에 정리했다. 기준 5(기능적 동등성)와 6(Git 변경 이력)은 구현하지 않아 "미확인"이고, 나머지는 분석기 결과와 가져오기 실행 결과로 계산했다. 기준 10은 재노출 확인(7)과 가져오기 성공(9)이 모두 있으면 "확정", 패키지 분할로 소스 동일성만 있으면 "검토 필요", 현재 경로가 없으면 "부적합"으로 둔 규칙 값이며 "확정"은 동작이 같다는 뜻이 아니다. 경로별 표는 저장소(</w:t>
       </w:r>
       <w:r>
         <w:rPr>
@@ -2524,6 +2524,117 @@
     </w:p>
     <w:p>
       <w:pPr>
+        <w:spacing w:before="0" w:after="0"/>
+        <w:ind w:firstLine="200"/>
+        <w:jc w:val="left"/>
+      </w:pPr>
+      <w:r>
+        <w:rPr>
+          <w:rFonts w:ascii="굴림" w:hAnsi="굴림" w:eastAsia="굴림"/>
+          <w:b/>
+        </w:rPr>
+        <w:t>4.6 추출 정확도(L4).</w:t>
+      </w:r>
+      <w:r>
+        <w:rPr>
+          <w:rFonts w:ascii="굴림" w:hAnsi="굴림" w:eastAsia="굴림"/>
+        </w:rPr>
+        <w:t xml:space="preserve"> 노트북 L4(코드 106줄)의 API 출현 41건에 대해 정답표를 분석기 출력 파일을 열지 않고 작성해 줄 단위로 비교했다. </w:t>
+      </w:r>
+      <w:r>
+        <w:rPr>
+          <w:rFonts w:ascii="Consolas" w:hAnsi="Consolas" w:eastAsia="굴림"/>
+          <w:sz w:val="18"/>
+        </w:rPr>
+        <w:t>?</w:t>
+      </w:r>
+      <w:r>
+        <w:rPr>
+          <w:rFonts w:ascii="굴림" w:hAnsi="굴림" w:eastAsia="굴림"/>
+        </w:rPr>
+        <w:t xml:space="preserve"> 포함 전체는 TP 36, FP 5, FN 5로 정밀도·재현율이 모두 0.878이고, 경로가 확정된 항목만 보면 TP 35, FP 0, FN 5로 정밀도 1.000, 재현율 0.875이다. 불일치 5건은 모두 </w:t>
+      </w:r>
+      <w:r>
+        <w:rPr>
+          <w:rFonts w:ascii="Consolas" w:hAnsi="Consolas" w:eastAsia="굴림"/>
+          <w:sz w:val="18"/>
+        </w:rPr>
+        <w:t>from_texts</w:t>
+      </w:r>
+      <w:r>
+        <w:rPr>
+          <w:rFonts w:ascii="굴림" w:hAnsi="굴림" w:eastAsia="굴림"/>
+        </w:rPr>
+        <w:t>·</w:t>
+      </w:r>
+      <w:r>
+        <w:rPr>
+          <w:rFonts w:ascii="Consolas" w:hAnsi="Consolas" w:eastAsia="굴림"/>
+          <w:sz w:val="18"/>
+        </w:rPr>
+        <w:t>from_llm</w:t>
+      </w:r>
+      <w:r>
+        <w:rPr>
+          <w:rFonts w:ascii="굴림" w:hAnsi="굴림" w:eastAsia="굴림"/>
+        </w:rPr>
+        <w:t xml:space="preserve">이 돌려준 객체의 메서드 호출(예: </w:t>
+      </w:r>
+      <w:r>
+        <w:rPr>
+          <w:rFonts w:ascii="Consolas" w:hAnsi="Consolas" w:eastAsia="굴림"/>
+          <w:sz w:val="18"/>
+        </w:rPr>
+        <w:t>smalldb.similarity_search</w:t>
+      </w:r>
+      <w:r>
+        <w:rPr>
+          <w:rFonts w:ascii="굴림" w:hAnsi="굴림" w:eastAsia="굴림"/>
+        </w:rPr>
+        <w:t xml:space="preserve">)로, 정답표는 반환 객체의 클래스를 지정했고 분석기는 </w:t>
+      </w:r>
+      <w:r>
+        <w:rPr>
+          <w:rFonts w:ascii="Consolas" w:hAnsi="Consolas" w:eastAsia="굴림"/>
+          <w:sz w:val="18"/>
+        </w:rPr>
+        <w:t>?</w:t>
+      </w:r>
+      <w:r>
+        <w:rPr>
+          <w:rFonts w:ascii="굴림" w:hAnsi="굴림" w:eastAsia="굴림"/>
+        </w:rPr>
+        <w:t xml:space="preserve">로 두었다. 이 5건을 </w:t>
+      </w:r>
+      <w:r>
+        <w:rPr>
+          <w:rFonts w:ascii="Consolas" w:hAnsi="Consolas" w:eastAsia="굴림"/>
+          <w:sz w:val="18"/>
+        </w:rPr>
+        <w:t>?</w:t>
+      </w:r>
+      <w:r>
+        <w:rPr>
+          <w:rFonts w:ascii="굴림" w:hAnsi="굴림" w:eastAsia="굴림"/>
+        </w:rPr>
+        <w:t>가 맞다고 정하면 41/41이므로 값은 작성 기준에 민감하다. L4 한 개, 단일 작성자의 정답표라 일반화할 수 없다. 정답표는 저장소(</w:t>
+      </w:r>
+      <w:r>
+        <w:rPr>
+          <w:rFonts w:ascii="Consolas" w:hAnsi="Consolas" w:eastAsia="굴림"/>
+          <w:sz w:val="18"/>
+        </w:rPr>
+        <w:t>eval/labeling_sheet_L4_filled.csv</w:t>
+      </w:r>
+      <w:r>
+        <w:rPr>
+          <w:rFonts w:ascii="굴림" w:hAnsi="굴림" w:eastAsia="굴림"/>
+        </w:rPr>
+        <w:t>)[5]에 둔다.</w:t>
+      </w:r>
+    </w:p>
+    <w:p>
+      <w:pPr>
         <w:keepNext/>
         <w:spacing w:before="270" w:after="135"/>
         <w:jc w:val="left"/>
@@ -2552,7 +2663,7 @@
         <w:rPr>
           <w:rFonts w:ascii="굴림" w:hAnsi="굴림" w:eastAsia="굴림"/>
         </w:rPr>
-        <w:t xml:space="preserve"> 본 연구는 오래된 코드에서 "무엇이 오래되었는지"와 "현재 어떤 API로 바뀌었는지"를 알 수 없다는 문제에서 출발했다. 패키지 이름이 PyPI에 등록되어 있는지만으로는 이 정보를 얻을 수 없으므로, 노트북 6개에서 API 경로를 추출하고 배포본 소스의 근거로 현재 경로를 확인했다. 그 결과 첫째, 188건 중 146건(77.7%, 고유 경로 52개 중 48개)에서 기존 경로와 현재 경로를 파일·줄·버전 근거와 함께 제시했다. 둘째, 가져오기 실행으로 기존 경로 52개가 모두 실패하고 제시한 현재 경로 48개가 모두 성공함을 확인했다. 셋째, "최신에서 못 찾음"과 "이동이 확인됨"을 구분하여 이름만 비슷한 잘못된 대체 경로를 채택하지 않았다. 나머지 42건은 구식이 아니라 근거가 부족한 것이므로 사람의 확인이 필요하다.</w:t>
+        <w:t xml:space="preserve"> 본 연구는 오래된 코드에서 "무엇이 오래되었는지"와 "현재 어떤 API로 바뀌었는지"를 알 수 없다는 문제에서 출발했다. 패키지 이름이 PyPI에 등록되어 있는지만으로는 이 정보를 얻을 수 없으므로, 노트북 6개에서 API 경로를 추출하고 배포본 소스의 근거로 현재 경로를 확인했다. 그 결과 첫째, 188건 중 146건(77.7%, 고유 경로 52개 중 48개)에서 기존 경로와 현재 경로를 파일·줄·버전 근거와 함께 제시했다. 둘째, 가져오기 실행으로 기존 경로 52개가 모두 실패하고 제시한 현재 경로 48개가 모두 성공함을 확인했다. 셋째, "최신에서 못 찾음"과 "이동이 확인됨"을 구분하여 이름만 비슷한 잘못된 대체 경로를 채택하지 않았다.</w:t>
       </w:r>
     </w:p>
     <w:p>
@@ -2572,7 +2683,7 @@
         <w:rPr>
           <w:rFonts w:ascii="굴림" w:hAnsi="굴림" w:eastAsia="굴림"/>
         </w:rPr>
-        <w:t xml:space="preserve"> (1) 경로 추출의 정밀도·재현율은 독립 수작업 정답표가 없어 평가하지 못했다. (2) 이동 확인은 경로 관계의 증거이며 매개변수·동작 호환성은 확인하지 않았고, 패키지 분할 10개 경로는 소스 동일성에 근거한다. (3) </w:t>
+        <w:t xml:space="preserve"> (1) 경로 추출의 정밀도·재현율은 L4 한 개 노트북에서만 단일 작성자의 정답표와 비교했고 나머지 5개는 평가하지 못했다. (2) 이동 확인은 경로 관계의 증거이며 매개변수·동작 호환성은 확인하지 않았고, 패키지 분할 10개 경로는 소스 동일성에 근거한다. (3) </w:t>
       </w:r>
       <w:r>
         <w:rPr>
@@ -2618,7 +2729,7 @@
         <w:rPr>
           <w:rFonts w:ascii="굴림" w:hAnsi="굴림" w:eastAsia="굴림"/>
         </w:rPr>
-        <w:t xml:space="preserve"> 각 한계에 대응하여 다음을 수행할 계획이다. (1) 노트북을 직접 읽어 독립 수작업 정답표를 만들고 경로 추출의 정밀도·재현율을 평가한다. (2) 근거 부족 4개 경로(18건)에 대해 여러 버전에 걸친 API 이력 데이터베이스를 구축해 근거를 보강할 수 있는지 검증한다. 이 데이터베이스는 현재 구현·실험에 포함되지 않았다. (3) 반환 타입 추론을 확대해 경로가 없는 24건을 줄인다. (4) 매개변수 호환성을 검증한다. (5) 다른 강좌·라이브러리로 대상을 넓혀 일반화 가능성을 확인한다.</w:t>
+        <w:t xml:space="preserve"> 각 한계에 대응하여 다음을 수행할 계획이다. (1) 나머지 노트북 5개의 정답표를 만들고 작성자 간 일치율을 확인해 경로 추출의 정밀도·재현율을 평가한다. (2) 근거 부족 4개 경로(18건)에 대해 여러 버전에 걸친 API 이력 데이터베이스를 구축해 근거를 보강할 수 있는지 검증한다. 이 데이터베이스는 현재 구현·실험에 포함되지 않았다. (3) 반환 타입 추론을 확대해 경로가 없는 24건을 줄인다. (4) 매개변수 호환성을 검증한다. (5) 다른 강좌·라이브러리로 대상을 넓혀 일반화 가능성을 확인한다.</w:t>
       </w:r>
     </w:p>
     <w:p>
@@ -2687,7 +2798,7 @@
           <w:rFonts w:ascii="굴림" w:hAnsi="굴림" w:eastAsia="굴림"/>
           <w:sz w:val="18"/>
         </w:rPr>
-        <w:t>[4] Python Package Index, release files of langchain, langchain-community, langchain-core, langchain-text-splitters, langchain-openai and langchain-classic, https://pypi.org/.</w:t>
+        <w:t>[4] Python Package Index, release files of the langchain packages, https://pypi.org/.</w:t>
       </w:r>
     </w:p>
     <w:p>
@@ -2701,7 +2812,7 @@
           <w:rFonts w:ascii="굴림" w:hAnsi="굴림" w:eastAsia="굴림"/>
           <w:sz w:val="18"/>
         </w:rPr>
-        <w:t>[5] "LangChain-Chat-with-Your-Data: API path analyzer, results and appendix," GitHub repository (main branch), https://github.com/seohyeonban/LangChain-Chat-with-Your-Data.</w:t>
+        <w:t>[5] "API path analyzer, results and appendix," GitHub repository (main), https://github.com/seohyeonban/LangChain-Chat-with-Your-Data.</w:t>
       </w:r>
     </w:p>
     <w:p>
@@ -2715,7 +2826,7 @@
           <w:rFonts w:ascii="굴림" w:hAnsi="굴림" w:eastAsia="굴림"/>
           <w:sz w:val="18"/>
         </w:rPr>
-        <w:t>[6] "LangChain: Chat with Your Data (course notebooks)," GitHub repository, https://github.com/ksm26/LangChain-Chat-with-Your-Data.</w:t>
+        <w:t>[6] "Course notebooks," GitHub repository, https://github.com/ksm26/LangChain-Chat-with-Your-Data.</w:t>
       </w:r>
     </w:p>
     <w:sectPr>

</xml_diff>